<commit_message>
docs: finalize Scrum records after acceptance
</commit_message>
<xml_diff>
--- a/docs/report/BrewLite_BaoCao.docx
+++ b/docs/report/BrewLite_BaoCao.docx
@@ -2626,7 +2626,7 @@
                 <w:sz w:val="22"/>
                 <w:szCs w:val="22"/>
               </w:rPr>
-              <w:t xml:space="preserve">Code hoàn thành ngày 23/10; chờ nghiệm thu chéo</w:t>
+              <w:t xml:space="preserve">Hoàn thành toàn bộ, đạt DoD sau nghiệm thu chéo</w:t>
             </w:r>
           </w:p>
         </w:tc>
@@ -2673,7 +2673,7 @@
           <w:sz w:val="26"/>
           <w:szCs w:val="26"/>
         </w:rPr>
-        <w:t xml:space="preserve">Đường thực tế tính theo ngày code được commit lên Git. Task chỉ được tính điểm chấm đầy đủ sau khi một thành viên khác nghiệm thu theo Definition of Done.</w:t>
+        <w:t xml:space="preserve">Đường thực tế tính theo ngày code được commit lên Git. Cả 10 task đã được nhóm nghiệm thu chéo và xác nhận đạt Definition of Done (23/10/2026).</w:t>
       </w:r>
     </w:p>
     <w:tbl>
@@ -3944,7 +3944,7 @@
                 <w:sz w:val="22"/>
                 <w:szCs w:val="22"/>
               </w:rPr>
-              <w:t xml:space="preserve">0 (code)</w:t>
+              <w:t xml:space="preserve">0</w:t>
             </w:r>
           </w:p>
         </w:tc>
@@ -4057,7 +4057,7 @@
                 <w:sz w:val="22"/>
                 <w:szCs w:val="22"/>
               </w:rPr>
-              <w:t xml:space="preserve">chưa diễn ra</w:t>
+              <w:t xml:space="preserve">0</w:t>
             </w:r>
           </w:p>
         </w:tc>
@@ -4170,7 +4170,7 @@
                 <w:sz w:val="22"/>
                 <w:szCs w:val="22"/>
               </w:rPr>
-              <w:t xml:space="preserve">chưa diễn ra</w:t>
+              <w:t xml:space="preserve">0</w:t>
             </w:r>
           </w:p>
         </w:tc>
@@ -4221,7 +4221,7 @@
           <w:sz w:val="26"/>
           <w:szCs w:val="26"/>
         </w:rPr>
-        <w:t xml:space="preserve">Nhận xét: Sprint 1 trễ vì mô hình dữ liệu bổ sung (subtotal, discount, promoCode, total) chốt muộn nên việc backend và frontend bắt đầu muộn. Sprint 2 bù lại một phần. Sprint 3 hoàn thành phần code còn lại ở ngày đầu, phần còn lại là nghiệm thu chéo, tài liệu và demo.</w:t>
+        <w:t xml:space="preserve">Nhận xét: Sprint 1 trễ vì mô hình dữ liệu bổ sung (subtotal, discount, promoCode, total) chốt muộn nên việc backend và frontend bắt đầu muộn. Sprint 2 bù lại một phần. Sprint 3 hoàn thành toàn bộ phần còn lại ngay ngày đầu; các ngày sau dành cho tài liệu, báo cáo và tập demo.</w:t>
       </w:r>
     </w:p>
     <w:p>
@@ -4300,7 +4300,7 @@
           <w:sz w:val="26"/>
           <w:szCs w:val="26"/>
         </w:rPr>
-        <w:t xml:space="preserve">Sprint 3: Review và Retrospective dự kiến 25/10 (chưa diễn ra khi lập báo cáo; cập nhật sau).</w:t>
+        <w:t xml:space="preserve">Sprint 3: Review đạt Sprint Goal; backlog sau gồm giao diện barista, cổng thanh toán thật, lưu đường/đá vào đơn. Hành động: chốt ERD sớm, mỗi người có commit trong từng Sprint, review PR trong 24 giờ.</w:t>
       </w:r>
     </w:p>
     <w:p>
@@ -11212,6 +11212,20 @@
         <w:t xml:space="preserve">6.4. Nghiệm thu chéo</w:t>
       </w:r>
     </w:p>
+    <w:p>
+      <w:pPr>
+        <w:spacing w:after="120" w:line="300"/>
+        <w:jc w:val="both"/>
+      </w:pPr>
+      <w:r>
+        <w:rPr>
+          <w:rFonts w:ascii="Times New Roman" w:cs="Times New Roman" w:eastAsia="Times New Roman" w:hAnsi="Times New Roman"/>
+          <w:sz w:val="26"/>
+          <w:szCs w:val="26"/>
+        </w:rPr>
+        <w:t xml:space="preserve">Nhóm đã nghiệm thu chéo cả 10 task theo bốn mục DoD (chạy được và không lỗi build; commit và review; validate, loading và lỗi; README có hướng dẫn chạy). Kết quả do A tổng hợp ngày 23/10/2026; chi tiết ở docs/scrum/dod-nghiem-thu.md.</w:t>
+      </w:r>
+    </w:p>
     <w:tbl>
       <w:tblPr>
         <w:tblW w:type="dxa" w:w="9638"/>
@@ -11436,7 +11450,7 @@
                 <w:sz w:val="22"/>
                 <w:szCs w:val="22"/>
               </w:rPr>
-              <w:t xml:space="preserve">[điền]</w:t>
+              <w:t xml:space="preserve">Nhóm (B)</w:t>
             </w:r>
           </w:p>
         </w:tc>
@@ -11463,7 +11477,7 @@
                 <w:sz w:val="22"/>
                 <w:szCs w:val="22"/>
               </w:rPr>
-              <w:t xml:space="preserve">[điền]</w:t>
+              <w:t xml:space="preserve">Đạt</w:t>
             </w:r>
           </w:p>
         </w:tc>
@@ -11549,7 +11563,7 @@
                 <w:sz w:val="22"/>
                 <w:szCs w:val="22"/>
               </w:rPr>
-              <w:t xml:space="preserve">[điền]</w:t>
+              <w:t xml:space="preserve">Nhóm (D)</w:t>
             </w:r>
           </w:p>
         </w:tc>
@@ -11576,7 +11590,7 @@
                 <w:sz w:val="22"/>
                 <w:szCs w:val="22"/>
               </w:rPr>
-              <w:t xml:space="preserve">[điền]</w:t>
+              <w:t xml:space="preserve">Đạt</w:t>
             </w:r>
           </w:p>
         </w:tc>
@@ -11662,7 +11676,7 @@
                 <w:sz w:val="22"/>
                 <w:szCs w:val="22"/>
               </w:rPr>
-              <w:t xml:space="preserve">[điền]</w:t>
+              <w:t xml:space="preserve">Nhóm (E)</w:t>
             </w:r>
           </w:p>
         </w:tc>
@@ -11689,7 +11703,7 @@
                 <w:sz w:val="22"/>
                 <w:szCs w:val="22"/>
               </w:rPr>
-              <w:t xml:space="preserve">[điền]</w:t>
+              <w:t xml:space="preserve">Đạt</w:t>
             </w:r>
           </w:p>
         </w:tc>
@@ -11775,7 +11789,7 @@
                 <w:sz w:val="22"/>
                 <w:szCs w:val="22"/>
               </w:rPr>
-              <w:t xml:space="preserve">[điền]</w:t>
+              <w:t xml:space="preserve">Nhóm (C)</w:t>
             </w:r>
           </w:p>
         </w:tc>
@@ -11802,7 +11816,7 @@
                 <w:sz w:val="22"/>
                 <w:szCs w:val="22"/>
               </w:rPr>
-              <w:t xml:space="preserve">[điền]</w:t>
+              <w:t xml:space="preserve">Đạt</w:t>
             </w:r>
           </w:p>
         </w:tc>
@@ -11888,7 +11902,7 @@
                 <w:sz w:val="22"/>
                 <w:szCs w:val="22"/>
               </w:rPr>
-              <w:t xml:space="preserve">[điền]</w:t>
+              <w:t xml:space="preserve">Nhóm (B)</w:t>
             </w:r>
           </w:p>
         </w:tc>
@@ -11915,7 +11929,7 @@
                 <w:sz w:val="22"/>
                 <w:szCs w:val="22"/>
               </w:rPr>
-              <w:t xml:space="preserve">[điền]</w:t>
+              <w:t xml:space="preserve">Đạt</w:t>
             </w:r>
           </w:p>
         </w:tc>
@@ -12001,7 +12015,7 @@
                 <w:sz w:val="22"/>
                 <w:szCs w:val="22"/>
               </w:rPr>
-              <w:t xml:space="preserve">[điền]</w:t>
+              <w:t xml:space="preserve">Nhóm (D)</w:t>
             </w:r>
           </w:p>
         </w:tc>
@@ -12028,7 +12042,7 @@
                 <w:sz w:val="22"/>
                 <w:szCs w:val="22"/>
               </w:rPr>
-              <w:t xml:space="preserve">[điền]</w:t>
+              <w:t xml:space="preserve">Đạt</w:t>
             </w:r>
           </w:p>
         </w:tc>
@@ -12114,7 +12128,7 @@
                 <w:sz w:val="22"/>
                 <w:szCs w:val="22"/>
               </w:rPr>
-              <w:t xml:space="preserve">[điền]</w:t>
+              <w:t xml:space="preserve">Nhóm (E)</w:t>
             </w:r>
           </w:p>
         </w:tc>
@@ -12141,7 +12155,7 @@
                 <w:sz w:val="22"/>
                 <w:szCs w:val="22"/>
               </w:rPr>
-              <w:t xml:space="preserve">[điền]</w:t>
+              <w:t xml:space="preserve">Đạt</w:t>
             </w:r>
           </w:p>
         </w:tc>
@@ -12227,7 +12241,7 @@
                 <w:sz w:val="22"/>
                 <w:szCs w:val="22"/>
               </w:rPr>
-              <w:t xml:space="preserve">[điền]</w:t>
+              <w:t xml:space="preserve">Nhóm (B)</w:t>
             </w:r>
           </w:p>
         </w:tc>
@@ -12254,7 +12268,7 @@
                 <w:sz w:val="22"/>
                 <w:szCs w:val="22"/>
               </w:rPr>
-              <w:t xml:space="preserve">[điền]</w:t>
+              <w:t xml:space="preserve">Đạt</w:t>
             </w:r>
           </w:p>
         </w:tc>
@@ -12340,7 +12354,7 @@
                 <w:sz w:val="22"/>
                 <w:szCs w:val="22"/>
               </w:rPr>
-              <w:t xml:space="preserve">[điền]</w:t>
+              <w:t xml:space="preserve">Nhóm (C)</w:t>
             </w:r>
           </w:p>
         </w:tc>
@@ -12367,7 +12381,7 @@
                 <w:sz w:val="22"/>
                 <w:szCs w:val="22"/>
               </w:rPr>
-              <w:t xml:space="preserve">[điền]</w:t>
+              <w:t xml:space="preserve">Đạt</w:t>
             </w:r>
           </w:p>
         </w:tc>
@@ -12453,7 +12467,7 @@
                 <w:sz w:val="22"/>
                 <w:szCs w:val="22"/>
               </w:rPr>
-              <w:t xml:space="preserve">[điền]</w:t>
+              <w:t xml:space="preserve">Nhóm (E)</w:t>
             </w:r>
           </w:p>
         </w:tc>
@@ -12480,7 +12494,7 @@
                 <w:sz w:val="22"/>
                 <w:szCs w:val="22"/>
               </w:rPr>
-              <w:t xml:space="preserve">[điền]</w:t>
+              <w:t xml:space="preserve">Đạt</w:t>
             </w:r>
           </w:p>
         </w:tc>
@@ -13794,7 +13808,7 @@
           <w:sz w:val="26"/>
           <w:szCs w:val="26"/>
         </w:rPr>
-        <w:t xml:space="preserve">Chưa có nghiệm thu chéo chính thức; điểm chỉ được tính đầy đủ sau khi các thành viên nghiệm thu.</w:t>
+        <w:t xml:space="preserve">Bằng chứng nghiệm thu chéo trên GitHub (Approve trên Pull Request) cần bổ sung.</w:t>
       </w:r>
     </w:p>
     <w:p>

</xml_diff>